<commit_message>
docs: restore Amrita logo on cover page and embed verified GitHub repository URL in project report
</commit_message>
<xml_diff>
--- a/report_output/ReqPilot_AI_Project_Report_Corrected.docx
+++ b/report_output/ReqPilot_AI_Project_Report_Corrected.docx
@@ -12,7 +12,38 @@
         <w:rPr>
           <w:rFonts w:ascii="Times New Roman" w:hAnsi="Times New Roman"/>
         </w:rPr>
-        <w:t>–</w:t>
+        <w:drawing>
+          <wp:inline xmlns:a="http://schemas.openxmlformats.org/drawingml/2006/main" xmlns:pic="http://schemas.openxmlformats.org/drawingml/2006/picture">
+            <wp:extent cx="2560320" cy="857603"/>
+            <wp:docPr id="1" name="Picture 1"/>
+            <wp:cNvGraphicFramePr>
+              <a:graphicFrameLocks noChangeAspect="1"/>
+            </wp:cNvGraphicFramePr>
+            <a:graphic>
+              <a:graphicData uri="http://schemas.openxmlformats.org/drawingml/2006/picture">
+                <pic:pic>
+                  <pic:nvPicPr>
+                    <pic:cNvPr id="0" name="amrita_logo.jpg"/>
+                    <pic:cNvPicPr/>
+                  </pic:nvPicPr>
+                  <pic:blipFill>
+                    <a:blip r:embed="rId9"/>
+                    <a:stretch>
+                      <a:fillRect/>
+                    </a:stretch>
+                  </pic:blipFill>
+                  <pic:spPr>
+                    <a:xfrm>
+                      <a:off x="0" y="0"/>
+                      <a:ext cx="2560320" cy="857603"/>
+                    </a:xfrm>
+                    <a:prstGeom prst="rect"/>
+                  </pic:spPr>
+                </pic:pic>
+              </a:graphicData>
+            </a:graphic>
+          </wp:inline>
+        </w:drawing>
       </w:r>
     </w:p>
     <w:p>
@@ -43,7 +74,7 @@
           <w:color w:val="282828"/>
           <w:sz w:val="26"/>
         </w:rPr>
-        <w:t>Full Stack Development  Project Report</w:t>
+        <w:t>Full Stack Development – Project Report</w:t>
       </w:r>
     </w:p>
     <w:p>
@@ -97,7 +128,7 @@
         <w:br/>
         <w:t>AMRITA SCHOOL OF COMPUTING</w:t>
         <w:br/>
-        <w:t>AMRITA VISHWA VIDYAPEETHAM, CHENNAI CAMPUS  601103</w:t>
+        <w:t>AMRITA VISHWA VIDYAPEETHAM, CHENNAI CAMPUS – 601103</w:t>
       </w:r>
     </w:p>
     <w:p>
@@ -112,7 +143,7 @@
           <w:b/>
           <w:sz w:val="22"/>
         </w:rPr>
-        <w:t>ACADEMIC YEAR: 2025  2026</w:t>
+        <w:t>ACADEMIC YEAR: 2025 – 2026</w:t>
       </w:r>
     </w:p>
     <w:p>
@@ -806,7 +837,7 @@
         <w:rPr>
           <w:rFonts w:ascii="Times New Roman" w:hAnsi="Times New Roman"/>
         </w:rPr>
-        <w:t>–</w:t>
+        <w:br w:type="page"/>
       </w:r>
     </w:p>
     <w:p>
@@ -1241,7 +1272,7 @@
           <w:color w:val="000000"/>
           <w:sz w:val="22"/>
         </w:rPr>
-        <w:t>Table 2.1  Comparative analysis of existing approaches vs. ReqPilot AI</w:t>
+        <w:t>Table 2.1 – Comparative analysis of existing approaches vs. ReqPilot AI</w:t>
       </w:r>
     </w:p>
     <w:tbl>
@@ -2126,7 +2157,7 @@
         <w:rPr>
           <w:rFonts w:ascii="Times New Roman" w:hAnsi="Times New Roman"/>
         </w:rPr>
-        <w:t>–</w:t>
+        <w:br w:type="page"/>
       </w:r>
     </w:p>
     <w:p>
@@ -2293,7 +2324,7 @@
           <w:color w:val="000000"/>
           <w:sz w:val="24"/>
         </w:rPr>
-        <w:t>3. 7-Dimensional Quality Audit System: Computes overall requirement quality scores (0100%) and granular breakdowns across completeness, clarity, atomicity, consistency, testability, feasibility, and traceability.</w:t>
+        <w:t>3. 7-Dimensional Quality Audit System: Computes overall requirement quality scores (0–100%) and granular breakdowns across completeness, clarity, atomicity, consistency, testability, feasibility, and traceability.</w:t>
       </w:r>
     </w:p>
     <w:p>
@@ -2447,7 +2478,7 @@
           <w:color w:val="000000"/>
           <w:sz w:val="22"/>
         </w:rPr>
-        <w:t>Table 3.1  Functional requirements of the ReqPilot AI platform</w:t>
+        <w:t>Table 3.1 – Functional requirements of the ReqPilot AI platform</w:t>
       </w:r>
     </w:p>
     <w:tbl>
@@ -3803,7 +3834,38 @@
         <w:rPr>
           <w:rFonts w:ascii="Times New Roman" w:hAnsi="Times New Roman"/>
         </w:rPr>
-        <w:t>–</w:t>
+        <w:drawing>
+          <wp:inline xmlns:a="http://schemas.openxmlformats.org/drawingml/2006/main" xmlns:pic="http://schemas.openxmlformats.org/drawingml/2006/picture">
+            <wp:extent cx="5486400" cy="3269673"/>
+            <wp:docPr id="2" name="Picture 2"/>
+            <wp:cNvGraphicFramePr>
+              <a:graphicFrameLocks noChangeAspect="1"/>
+            </wp:cNvGraphicFramePr>
+            <a:graphic>
+              <a:graphicData uri="http://schemas.openxmlformats.org/drawingml/2006/picture">
+                <pic:pic>
+                  <pic:nvPicPr>
+                    <pic:cNvPr id="0" name="fig_3_1_use_case_diagram.png"/>
+                    <pic:cNvPicPr/>
+                  </pic:nvPicPr>
+                  <pic:blipFill>
+                    <a:blip r:embed="rId12"/>
+                    <a:stretch>
+                      <a:fillRect/>
+                    </a:stretch>
+                  </pic:blipFill>
+                  <pic:spPr>
+                    <a:xfrm>
+                      <a:off x="0" y="0"/>
+                      <a:ext cx="5486400" cy="3269673"/>
+                    </a:xfrm>
+                    <a:prstGeom prst="rect"/>
+                  </pic:spPr>
+                </pic:pic>
+              </a:graphicData>
+            </a:graphic>
+          </wp:inline>
+        </w:drawing>
       </w:r>
     </w:p>
     <w:p>
@@ -3821,7 +3883,7 @@
           <w:color w:val="000000"/>
           <w:sz w:val="22"/>
         </w:rPr>
-        <w:t>Figure 3.1  Use case diagram of the ReqPilot AI platform</w:t>
+        <w:t>Figure 3.1 – Use case diagram of the ReqPilot AI platform</w:t>
       </w:r>
     </w:p>
     <w:p>
@@ -3857,7 +3919,7 @@
           <w:color w:val="000000"/>
           <w:sz w:val="22"/>
         </w:rPr>
-        <w:t>Table 3.2  Primary use case specification: UC-01 Requirements Elicitation &amp; Analysis</w:t>
+        <w:t>Table 3.2 – Primary use case specification: UC-01 Requirements Elicitation &amp; Analysis</w:t>
       </w:r>
     </w:p>
     <w:tbl>
@@ -4252,7 +4314,7 @@
         <w:rPr>
           <w:rFonts w:ascii="Times New Roman" w:hAnsi="Times New Roman"/>
         </w:rPr>
-        <w:t>–</w:t>
+        <w:br w:type="page"/>
       </w:r>
     </w:p>
     <w:p>
@@ -4333,7 +4395,38 @@
         <w:rPr>
           <w:rFonts w:ascii="Times New Roman" w:hAnsi="Times New Roman"/>
         </w:rPr>
-        <w:t>–</w:t>
+        <w:drawing>
+          <wp:inline xmlns:a="http://schemas.openxmlformats.org/drawingml/2006/main" xmlns:pic="http://schemas.openxmlformats.org/drawingml/2006/picture">
+            <wp:extent cx="5486400" cy="3269673"/>
+            <wp:docPr id="3" name="Picture 3"/>
+            <wp:cNvGraphicFramePr>
+              <a:graphicFrameLocks noChangeAspect="1"/>
+            </wp:cNvGraphicFramePr>
+            <a:graphic>
+              <a:graphicData uri="http://schemas.openxmlformats.org/drawingml/2006/picture">
+                <pic:pic>
+                  <pic:nvPicPr>
+                    <pic:cNvPr id="0" name="fig_4_1_overall_architecture.png"/>
+                    <pic:cNvPicPr/>
+                  </pic:nvPicPr>
+                  <pic:blipFill>
+                    <a:blip r:embed="rId13"/>
+                    <a:stretch>
+                      <a:fillRect/>
+                    </a:stretch>
+                  </pic:blipFill>
+                  <pic:spPr>
+                    <a:xfrm>
+                      <a:off x="0" y="0"/>
+                      <a:ext cx="5486400" cy="3269673"/>
+                    </a:xfrm>
+                    <a:prstGeom prst="rect"/>
+                  </pic:spPr>
+                </pic:pic>
+              </a:graphicData>
+            </a:graphic>
+          </wp:inline>
+        </w:drawing>
       </w:r>
     </w:p>
     <w:p>
@@ -4349,7 +4442,7 @@
           <w:i/>
           <w:sz w:val="22"/>
         </w:rPr>
-        <w:t>Figure 4.1  High-level multi-tier system architecture of the ReqPilot AI platform</w:t>
+        <w:t>Figure 4.1 – High-level multi-tier system architecture of the ReqPilot AI platform</w:t>
       </w:r>
     </w:p>
     <w:p>
@@ -4538,7 +4631,7 @@
           <w:color w:val="000000"/>
           <w:sz w:val="22"/>
         </w:rPr>
-        <w:t>Table 4.1  Backend API endpoint summary and route specification</w:t>
+        <w:t>Table 4.1 – Backend API endpoint summary and route specification</w:t>
       </w:r>
     </w:p>
     <w:tbl>
@@ -5746,7 +5839,38 @@
         <w:rPr>
           <w:rFonts w:ascii="Times New Roman" w:hAnsi="Times New Roman"/>
         </w:rPr>
-        <w:t>–</w:t>
+        <w:drawing>
+          <wp:inline xmlns:a="http://schemas.openxmlformats.org/drawingml/2006/main" xmlns:pic="http://schemas.openxmlformats.org/drawingml/2006/picture">
+            <wp:extent cx="5486400" cy="3274082"/>
+            <wp:docPr id="4" name="Picture 4"/>
+            <wp:cNvGraphicFramePr>
+              <a:graphicFrameLocks noChangeAspect="1"/>
+            </wp:cNvGraphicFramePr>
+            <a:graphic>
+              <a:graphicData uri="http://schemas.openxmlformats.org/drawingml/2006/picture">
+                <pic:pic>
+                  <pic:nvPicPr>
+                    <pic:cNvPr id="0" name="fig_4_3_database_er_diagram.png"/>
+                    <pic:cNvPicPr/>
+                  </pic:nvPicPr>
+                  <pic:blipFill>
+                    <a:blip r:embed="rId14"/>
+                    <a:stretch>
+                      <a:fillRect/>
+                    </a:stretch>
+                  </pic:blipFill>
+                  <pic:spPr>
+                    <a:xfrm>
+                      <a:off x="0" y="0"/>
+                      <a:ext cx="5486400" cy="3274082"/>
+                    </a:xfrm>
+                    <a:prstGeom prst="rect"/>
+                  </pic:spPr>
+                </pic:pic>
+              </a:graphicData>
+            </a:graphic>
+          </wp:inline>
+        </w:drawing>
       </w:r>
     </w:p>
     <w:p>
@@ -5762,7 +5886,7 @@
           <w:i/>
           <w:sz w:val="22"/>
         </w:rPr>
-        <w:t>Figure 4.3  Conceptual Entity-Relationship (ER) diagram of core ReqPilot AI database entities</w:t>
+        <w:t>Figure 4.3 – Conceptual Entity-Relationship (ER) diagram of core ReqPilot AI database entities</w:t>
       </w:r>
     </w:p>
     <w:p>
@@ -5793,7 +5917,7 @@
           <w:i/>
           <w:sz w:val="22"/>
         </w:rPr>
-        <w:t>Table 4.2  Selected core database entity specifications and relational constraints</w:t>
+        <w:t>Table 4.2 – Selected core database entity specifications and relational constraints</w:t>
       </w:r>
     </w:p>
     <w:tbl>
@@ -6968,7 +7092,38 @@
         <w:rPr>
           <w:rFonts w:ascii="Times New Roman" w:hAnsi="Times New Roman"/>
         </w:rPr>
-        <w:t>–</w:t>
+        <w:drawing>
+          <wp:inline xmlns:a="http://schemas.openxmlformats.org/drawingml/2006/main" xmlns:pic="http://schemas.openxmlformats.org/drawingml/2006/picture">
+            <wp:extent cx="5486400" cy="2977899"/>
+            <wp:docPr id="5" name="Picture 5"/>
+            <wp:cNvGraphicFramePr>
+              <a:graphicFrameLocks noChangeAspect="1"/>
+            </wp:cNvGraphicFramePr>
+            <a:graphic>
+              <a:graphicData uri="http://schemas.openxmlformats.org/drawingml/2006/picture">
+                <pic:pic>
+                  <pic:nvPicPr>
+                    <pic:cNvPr id="0" name="fig_4_2_workflow_pipeline.png"/>
+                    <pic:cNvPicPr/>
+                  </pic:nvPicPr>
+                  <pic:blipFill>
+                    <a:blip r:embed="rId15"/>
+                    <a:stretch>
+                      <a:fillRect/>
+                    </a:stretch>
+                  </pic:blipFill>
+                  <pic:spPr>
+                    <a:xfrm>
+                      <a:off x="0" y="0"/>
+                      <a:ext cx="5486400" cy="2977899"/>
+                    </a:xfrm>
+                    <a:prstGeom prst="rect"/>
+                  </pic:spPr>
+                </pic:pic>
+              </a:graphicData>
+            </a:graphic>
+          </wp:inline>
+        </w:drawing>
       </w:r>
     </w:p>
     <w:p>
@@ -6986,7 +7141,7 @@
           <w:color w:val="000000"/>
           <w:sz w:val="22"/>
         </w:rPr>
-        <w:t>Figure 4.2  Data flow and multi-agent workflow pipeline of ReqPilot AI</w:t>
+        <w:t>Figure 4.2 – Data flow and multi-agent workflow pipeline of ReqPilot AI</w:t>
       </w:r>
     </w:p>
     <w:p>
@@ -6994,7 +7149,7 @@
         <w:rPr>
           <w:rFonts w:ascii="Times New Roman" w:hAnsi="Times New Roman"/>
         </w:rPr>
-        <w:t>–</w:t>
+        <w:br w:type="page"/>
       </w:r>
     </w:p>
     <w:p>
@@ -7117,7 +7272,7 @@
           <w:color w:val="000000"/>
           <w:sz w:val="22"/>
         </w:rPr>
-        <w:t>Table 5.1  Development environment, software versions, and dependencies</w:t>
+        <w:t>Table 5.1 – Development environment, software versions, and dependencies</w:t>
       </w:r>
     </w:p>
     <w:tbl>
@@ -8054,7 +8209,7 @@
           <w:b/>
           <w:sz w:val="20"/>
         </w:rPr>
-        <w:t>Listing 5.1  Mathematical 7-Dimensional Quality Scoring Implementation (quality_agent.py)</w:t>
+        <w:t>Listing 5.1 – Mathematical 7-Dimensional Quality Scoring Implementation (quality_agent.py)</w:t>
       </w:r>
     </w:p>
     <w:tbl>
@@ -8129,7 +8284,7 @@
           <w:b/>
           <w:sz w:val="22"/>
         </w:rPr>
-        <w:t>Listing 5.2  NetworkX DAG Task Scheduling with Fallback Handling (scheduling_agent.py excerpt)</w:t>
+        <w:t>Listing 5.2 – NetworkX DAG Task Scheduling with Fallback Handling (scheduling_agent.py excerpt)</w:t>
       </w:r>
     </w:p>
     <w:tbl>
@@ -8204,7 +8359,7 @@
           <w:b/>
           <w:sz w:val="22"/>
         </w:rPr>
-        <w:t>Listing 5.3  Change Impact Blast-Radius and Heuristic Risk Assessment (change_impact_agent.py excerpt)</w:t>
+        <w:t>Listing 5.3 – Change Impact Blast-Radius and Heuristic Risk Assessment (change_impact_agent.py excerpt)</w:t>
       </w:r>
     </w:p>
     <w:tbl>
@@ -8279,7 +8434,7 @@
         <w:rPr>
           <w:rFonts w:ascii="Times New Roman" w:hAnsi="Times New Roman"/>
         </w:rPr>
-        <w:t>–</w:t>
+        <w:br w:type="page"/>
       </w:r>
     </w:p>
     <w:p>
@@ -8390,7 +8545,38 @@
         <w:jc w:val="center"/>
       </w:pPr>
       <w:r>
-        <w:t>–</w:t>
+        <w:drawing>
+          <wp:inline xmlns:a="http://schemas.openxmlformats.org/drawingml/2006/main" xmlns:pic="http://schemas.openxmlformats.org/drawingml/2006/picture">
+            <wp:extent cx="5120640" cy="5389362"/>
+            <wp:docPr id="6" name="Picture 6"/>
+            <wp:cNvGraphicFramePr>
+              <a:graphicFrameLocks noChangeAspect="1"/>
+            </wp:cNvGraphicFramePr>
+            <a:graphic>
+              <a:graphicData uri="http://schemas.openxmlformats.org/drawingml/2006/picture">
+                <pic:pic>
+                  <pic:nvPicPr>
+                    <pic:cNvPr id="0" name="image.png"/>
+                    <pic:cNvPicPr/>
+                  </pic:nvPicPr>
+                  <pic:blipFill>
+                    <a:blip r:embed="rId16"/>
+                    <a:stretch>
+                      <a:fillRect/>
+                    </a:stretch>
+                  </pic:blipFill>
+                  <pic:spPr>
+                    <a:xfrm>
+                      <a:off x="0" y="0"/>
+                      <a:ext cx="5120640" cy="5389362"/>
+                    </a:xfrm>
+                    <a:prstGeom prst="rect"/>
+                  </pic:spPr>
+                </pic:pic>
+              </a:graphicData>
+            </a:graphic>
+          </wp:inline>
+        </w:drawing>
       </w:r>
     </w:p>
     <w:p>
@@ -8404,7 +8590,7 @@
           <w:i/>
           <w:sz w:val="22"/>
         </w:rPr>
-        <w:t>Figure 6.1  User interface of the ReqPilot AI platform workspace</w:t>
+        <w:t>Figure 6.1 – User interface of the ReqPilot AI platform workspace</w:t>
       </w:r>
     </w:p>
     <w:p>
@@ -8586,7 +8772,7 @@
           <w:i/>
           <w:sz w:val="22"/>
         </w:rPr>
-        <w:t>Table 6.1  Functional test execution matrix and verification results</w:t>
+        <w:t>Table 6.1 – Functional test execution matrix and verification results</w:t>
       </w:r>
     </w:p>
     <w:tbl>
@@ -9328,7 +9514,7 @@
           <w:i/>
           <w:sz w:val="22"/>
         </w:rPr>
-        <w:t>Table 6.2  Official multi-project benchmark evaluation results across the four retained domains</w:t>
+        <w:t>Table 6.2 – Official multi-project benchmark evaluation results across the four retained domains</w:t>
       </w:r>
     </w:p>
     <w:tbl>
@@ -10140,7 +10326,38 @@
         <w:jc w:val="center"/>
       </w:pPr>
       <w:r>
-        <w:t>–</w:t>
+        <w:drawing>
+          <wp:inline xmlns:a="http://schemas.openxmlformats.org/drawingml/2006/main" xmlns:pic="http://schemas.openxmlformats.org/drawingml/2006/picture">
+            <wp:extent cx="5029200" cy="2873829"/>
+            <wp:docPr id="7" name="Picture 7"/>
+            <wp:cNvGraphicFramePr>
+              <a:graphicFrameLocks noChangeAspect="1"/>
+            </wp:cNvGraphicFramePr>
+            <a:graphic>
+              <a:graphicData uri="http://schemas.openxmlformats.org/drawingml/2006/picture">
+                <pic:pic>
+                  <pic:nvPicPr>
+                    <pic:cNvPr id="0" name="four_domain_eval_chart.png"/>
+                    <pic:cNvPicPr/>
+                  </pic:nvPicPr>
+                  <pic:blipFill>
+                    <a:blip r:embed="rId19"/>
+                    <a:stretch>
+                      <a:fillRect/>
+                    </a:stretch>
+                  </pic:blipFill>
+                  <pic:spPr>
+                    <a:xfrm>
+                      <a:off x="0" y="0"/>
+                      <a:ext cx="5029200" cy="2873829"/>
+                    </a:xfrm>
+                    <a:prstGeom prst="rect"/>
+                  </pic:spPr>
+                </pic:pic>
+              </a:graphicData>
+            </a:graphic>
+          </wp:inline>
+        </w:drawing>
       </w:r>
     </w:p>
     <w:p>
@@ -10154,7 +10371,7 @@
           <w:i/>
           <w:sz w:val="22"/>
         </w:rPr>
-        <w:t>Figure 6.2  Requirements classification accuracy and macro-F1 across the four retained domains</w:t>
+        <w:t>Figure 6.2 – Requirements classification accuracy and macro-F1 across the four retained domains</w:t>
       </w:r>
     </w:p>
     <w:p>
@@ -10162,7 +10379,38 @@
         <w:jc w:val="center"/>
       </w:pPr>
       <w:r>
-        <w:t>–</w:t>
+        <w:drawing>
+          <wp:inline xmlns:a="http://schemas.openxmlformats.org/drawingml/2006/main" xmlns:pic="http://schemas.openxmlformats.org/drawingml/2006/picture">
+            <wp:extent cx="5029200" cy="2730137"/>
+            <wp:docPr id="8" name="Picture 8"/>
+            <wp:cNvGraphicFramePr>
+              <a:graphicFrameLocks noChangeAspect="1"/>
+            </wp:cNvGraphicFramePr>
+            <a:graphic>
+              <a:graphicData uri="http://schemas.openxmlformats.org/drawingml/2006/picture">
+                <pic:pic>
+                  <pic:nvPicPr>
+                    <pic:cNvPr id="0" name="verification_summary_chart.png"/>
+                    <pic:cNvPicPr/>
+                  </pic:nvPicPr>
+                  <pic:blipFill>
+                    <a:blip r:embed="rId20"/>
+                    <a:stretch>
+                      <a:fillRect/>
+                    </a:stretch>
+                  </pic:blipFill>
+                  <pic:spPr>
+                    <a:xfrm>
+                      <a:off x="0" y="0"/>
+                      <a:ext cx="5029200" cy="2730137"/>
+                    </a:xfrm>
+                    <a:prstGeom prst="rect"/>
+                  </pic:spPr>
+                </pic:pic>
+              </a:graphicData>
+            </a:graphic>
+          </wp:inline>
+        </w:drawing>
       </w:r>
     </w:p>
     <w:p>
@@ -10176,7 +10424,7 @@
           <w:i/>
           <w:sz w:val="22"/>
         </w:rPr>
-        <w:t>Figure 6.3  Test suite verification pass rate and structural integrity metrics</w:t>
+        <w:t>Figure 6.3 – Test suite verification pass rate and structural integrity metrics</w:t>
       </w:r>
     </w:p>
     <w:p>
@@ -10691,7 +10939,7 @@
         <w:rPr>
           <w:rFonts w:ascii="Times New Roman" w:hAnsi="Times New Roman"/>
         </w:rPr>
-        <w:t>–</w:t>
+        <w:br w:type="page"/>
       </w:r>
     </w:p>
     <w:p>
@@ -10725,7 +10973,7 @@
           <w:color w:val="000000"/>
           <w:sz w:val="22"/>
         </w:rPr>
-        <w:t>[1] B. W. Boehm, "Software engineering economics," IEEE Transactions on Software Engineering, vol. SE-10, no. 1, pp. 421, Jan. 1984.</w:t>
+        <w:t>[1] B. W. Boehm, "Software engineering economics," IEEE Transactions on Software Engineering, vol. SE-10, no. 1, pp. 4–21, Jan. 1984.</w:t>
       </w:r>
     </w:p>
     <w:p>
@@ -10793,7 +11041,7 @@
           <w:color w:val="000000"/>
           <w:sz w:val="22"/>
         </w:rPr>
-        <w:t>[5] P. Arora, F. Dalpiaz, and S. Brinkkemper, "Refining natural language requirements using large language models," in Proc. 32nd IEEE Int. Requirements Engineering Conf. (RE), Reykjavik, Iceland, 2024, pp. 112123.</w:t>
+        <w:t>[5] P. Arora, F. Dalpiaz, and S. Brinkkemper, "Refining natural language requirements using large language models," in Proc. 32nd IEEE Int. Requirements Engineering Conf. (RE), Reykjavik, Iceland, 2024, pp. 112–123.</w:t>
       </w:r>
     </w:p>
     <w:p>
@@ -10827,7 +11075,7 @@
           <w:color w:val="000000"/>
           <w:sz w:val="22"/>
         </w:rPr>
-        <w:t>[7] D. Mendez Fernandez et al., "Naming the pain in requirements engineering: Contemporary problems, causes, and effects in practice," Empirical Software Engineering, vol. 22, no. 5, pp. 22982338, 2017.</w:t>
+        <w:t>[7] D. Mendez Fernandez et al., "Naming the pain in requirements engineering: Contemporary problems, causes, and effects in practice," Empirical Software Engineering, vol. 22, no. 5, pp. 2298–2338, 2017.</w:t>
       </w:r>
     </w:p>
     <w:p>
@@ -10925,7 +11173,7 @@
           <w:color w:val="000000"/>
           <w:sz w:val="22"/>
         </w:rPr>
-        <w:t>[13] E. Ferrari, G. Spoletini, and S. Gnesi, "Ambiguity in natural language requirements: A systematic literature review," ACM Computing Surveys, vol. 55, no. 6, pp. 136, 2023.</w:t>
+        <w:t>[13] E. Ferrari, G. Spoletini, and S. Gnesi, "Ambiguity in natural language requirements: A systematic literature review," ACM Computing Surveys, vol. 55, no. 6, pp. 1–36, 2023.</w:t>
       </w:r>
     </w:p>
     <w:p>
@@ -10942,7 +11190,7 @@
           <w:color w:val="000000"/>
           <w:sz w:val="22"/>
         </w:rPr>
-        <w:t>[14] M. J. Harrold and G. Rothermel, "A safe, efficient regression test selection technique," ACM Trans. Softw. Eng. Methodol., vol. 6, no. 2, pp. 173210, 1997.</w:t>
+        <w:t>[14] M. J. Harrold and G. Rothermel, "A safe, efficient regression test selection technique," ACM Trans. Softw. Eng. Methodol., vol. 6, no. 2, pp. 173–210, 1997.</w:t>
       </w:r>
     </w:p>
     <w:p>
@@ -10959,7 +11207,7 @@
           <w:color w:val="000000"/>
           <w:sz w:val="22"/>
         </w:rPr>
-        <w:t>[15] C. D. Manning et al., "The Stanford CoreNLP natural language processing toolkit," in Proc. 52nd Annual Meeting of the Assoc. for Computational Linguistics: System Demonstrations, Baltimore, MD, 2014, pp. 5560.</w:t>
+        <w:t>[15] C. D. Manning et al., "The Stanford CoreNLP natural language processing toolkit," in Proc. 52nd Annual Meeting of the Assoc. for Computational Linguistics: System Demonstrations, Baltimore, MD, 2014, pp. 55–60.</w:t>
       </w:r>
     </w:p>
     <w:p>
@@ -10976,7 +11224,7 @@
           <w:color w:val="000000"/>
           <w:sz w:val="22"/>
         </w:rPr>
-        <w:t>[16] A. Zouaq and R. Nkambou, "Evaluating the generation of domain ontologies in the light of the Semantic Web," IEEE Trans. Knowl. Data Eng., vol. 21, no. 12, pp. 17591772, 2009.</w:t>
+        <w:t>[16] A. Zouaq and R. Nkambou, "Evaluating the generation of domain ontologies in the light of the Semantic Web," IEEE Trans. Knowl. Data Eng., vol. 21, no. 12, pp. 1759–1772, 2009.</w:t>
       </w:r>
     </w:p>
     <w:p>
@@ -10993,7 +11241,7 @@
           <w:color w:val="000000"/>
           <w:sz w:val="22"/>
         </w:rPr>
-        <w:t>[17] Y. Yao et al., "Tree of thoughts: Deliberate problem solving with large language models," in Advances in Neural Information Processing Systems (NeurIPS), vol. 36, 2023, pp. 1180911822.</w:t>
+        <w:t>[17] Y. Yao et al., "Tree of thoughts: Deliberate problem solving with large language models," in Advances in Neural Information Processing Systems (NeurIPS), vol. 36, 2023, pp. 11809–11822.</w:t>
       </w:r>
     </w:p>
     <w:p>
@@ -11069,7 +11317,7 @@
         <w:rPr>
           <w:rFonts w:ascii="Times New Roman" w:hAnsi="Times New Roman"/>
         </w:rPr>
-        <w:t>–</w:t>
+        <w:br w:type="page"/>
       </w:r>
     </w:p>
     <w:p>
@@ -11250,7 +11498,7 @@
           <w:rFonts w:ascii="Times New Roman" w:hAnsi="Times New Roman"/>
           <w:sz w:val="22"/>
         </w:rPr>
-        <w:t>Official Repository URL: [INSERT VERIFIED GITHUB REPOSITORY URL]</w:t>
+        <w:t>Official Repository URL: https://github.com/NAYANESHREDDY/ReqPilot-AI</w:t>
       </w:r>
     </w:p>
     <w:p>

</xml_diff>